<commit_message>
Add dbt snapshot, update docs and diagrams
</commit_message>
<xml_diff>
--- a/docs/Dokumentasi_Price_Analytics.docx
+++ b/docs/Dokumentasi_Price_Analytics.docx
@@ -479,7 +479,7 @@
                 <w:sz w:val="18"/>
                 <w:szCs w:val="18"/>
               </w:rPr>
-              <w:t xml:space="preserve">Raw, silver, gold; star schema; pencocokan produk; riwayat SCD Tipe 2; model incremental; tes kualitas; freshness; deskripsi seluruh kolom</w:t>
+              <w:t xml:space="preserve">Raw, silver, gold; star schema; pencocokan produk; dbt snapshot SCD Tipe 2 dan model riwayat; model incremental; tes kualitas; freshness; deskripsi seluruh kolom</w:t>
             </w:r>
           </w:p>
         </w:tc>
@@ -1246,7 +1246,7 @@
                 <w:sz w:val="18"/>
                 <w:szCs w:val="18"/>
               </w:rPr>
-              <w:t xml:space="preserve">98 hasil (seed, model, dan tes data) lulus, 0 gagal</w:t>
+              <w:t xml:space="preserve">103 hasil (seed, model, snapshot, dan tes data) lulus, 0 gagal</w:t>
             </w:r>
           </w:p>
         </w:tc>
@@ -4385,15 +4385,102 @@
         <w:spacing w:after="120" w:line="276"/>
       </w:pPr>
       <w:r>
+        <w:t xml:space="preserve">Riwayat atribut listing tersedia dalam dua bentuk:</w:t>
+      </w:r>
+    </w:p>
+    <w:p>
+      <w:pPr>
+        <w:pStyle w:val="ListParagraph"/>
+        <w:numPr>
+          <w:ilvl w:val="0"/>
+          <w:numId w:val="2"/>
+        </w:numPr>
+        <w:spacing w:after="60" w:line="276"/>
+      </w:pPr>
+      <w:r>
+        <w:rPr>
+          <w:b/>
+          <w:bCs/>
+        </w:rPr>
+        <w:t xml:space="preserve">snap_platform_listing adalah dbt snapshot sungguhan</w:t>
+      </w:r>
+      <w:r>
+        <w:t xml:space="preserve"> (strategi </w:t>
+      </w:r>
+      <w:r>
         <w:rPr>
           <w:rFonts w:ascii="Consolas" w:cs="Consolas" w:eastAsia="Consolas" w:hAnsi="Consolas"/>
           <w:sz w:val="20"/>
           <w:szCs w:val="20"/>
         </w:rPr>
+        <w:t xml:space="preserve">check</w:t>
+      </w:r>
+      <w:r>
+        <w:t xml:space="preserve"> pada nama listing dan produk kanonik yang cocok). dbt mengisi </w:t>
+      </w:r>
+      <w:r>
+        <w:rPr>
+          <w:rFonts w:ascii="Consolas" w:cs="Consolas" w:eastAsia="Consolas" w:hAnsi="Consolas"/>
+          <w:sz w:val="20"/>
+          <w:szCs w:val="20"/>
+        </w:rPr>
+        <w:t xml:space="preserve">dbt_valid_from</w:t>
+      </w:r>
+      <w:r>
+        <w:t xml:space="preserve"> dan </w:t>
+      </w:r>
+      <w:r>
+        <w:rPr>
+          <w:rFonts w:ascii="Consolas" w:cs="Consolas" w:eastAsia="Consolas" w:hAnsi="Consolas"/>
+          <w:sz w:val="20"/>
+          <w:szCs w:val="20"/>
+        </w:rPr>
+        <w:t xml:space="preserve">dbt_valid_to</w:t>
+      </w:r>
+      <w:r>
+        <w:t xml:space="preserve"> dari waktu snapshot dijalankan, sehingga pada pemuatan historis sekaligus hanya terbentuk satu versi, dan riwayat bertambah seiring snapshot dijalankan setelah tiap crawl. Mekanismenya dapat didemonstrasikan dengan </w:t>
+      </w:r>
+      <w:r>
+        <w:rPr>
+          <w:rFonts w:ascii="Consolas" w:cs="Consolas" w:eastAsia="Consolas" w:hAnsi="Consolas"/>
+          <w:sz w:val="20"/>
+          <w:szCs w:val="20"/>
+        </w:rPr>
+        <w:t xml:space="preserve">dbt snapshot --vars '{snapshot_as_of_date: 2026-10-01}'</w:t>
+      </w:r>
+      <w:r>
+        <w:t xml:space="preserve"> lalu </w:t>
+      </w:r>
+      <w:r>
+        <w:rPr>
+          <w:rFonts w:ascii="Consolas" w:cs="Consolas" w:eastAsia="Consolas" w:hAnsi="Consolas"/>
+          <w:sz w:val="20"/>
+          <w:szCs w:val="20"/>
+        </w:rPr>
+        <w:t xml:space="preserve">dbt snapshot</w:t>
+      </w:r>
+      <w:r>
+        <w:t xml:space="preserve">, yang mengubah 115 baris menjadi 118 (3 listing berganti nama, versi lamanya ditutup).</w:t>
+      </w:r>
+    </w:p>
+    <w:p>
+      <w:pPr>
+        <w:pStyle w:val="ListParagraph"/>
+        <w:numPr>
+          <w:ilvl w:val="0"/>
+          <w:numId w:val="2"/>
+        </w:numPr>
+        <w:spacing w:after="60" w:line="276"/>
+      </w:pPr>
+      <w:r>
+        <w:rPr>
+          <w:b/>
+          <w:bCs/>
+        </w:rPr>
         <w:t xml:space="preserve">dim_platform_listing</w:t>
       </w:r>
       <w:r>
-        <w:t xml:space="preserve"> menyimpan versi nama listing dan produk kanonik yang cocok, dengan </w:t>
+        <w:t xml:space="preserve"> menghitung riwayat dari tanggal crawl, dengan </w:t>
       </w:r>
       <w:r>
         <w:rPr>
@@ -4426,18 +4513,15 @@
         <w:t xml:space="preserve">is_current</w:t>
       </w:r>
       <w:r>
-        <w:t xml:space="preserve">. Pada data sampel, 3 dari 115 listing berganti nama, sehingga ada 118 versi. Riwayat dihitung dari tanggal crawl, bukan dengan </w:t>
-      </w:r>
-      <w:r>
-        <w:rPr>
-          <w:rFonts w:ascii="Consolas" w:cs="Consolas" w:eastAsia="Consolas" w:hAnsi="Consolas"/>
-          <w:sz w:val="20"/>
-          <w:szCs w:val="20"/>
-        </w:rPr>
-        <w:t xml:space="preserve">dbt snapshot</w:t>
-      </w:r>
-      <w:r>
-        <w:t xml:space="preserve">: snapshot mencatat waktu dbt dijalankan, sehingga pada pemuatan historis sekaligus hasilnya hanya satu versi. Soal membolehkan "snapshot atau yang setara". Dua tes memastikan tiap listing punya tepat satu versi berlaku dan rentang versi tidak tumpang tindih.</w:t>
+        <w:t xml:space="preserve">, sehingga riwayat langsung terlihat pada data historis. Pada data sampel, 3 dari 115 listing berganti nama, sehingga ada 118 versi.</w:t>
+      </w:r>
+    </w:p>
+    <w:p>
+      <w:pPr>
+        <w:spacing w:after="120" w:line="276"/>
+      </w:pPr>
+      <w:r>
+        <w:t xml:space="preserve">Tes memastikan tiap listing punya tepat satu versi berlaku (pada model maupun snapshot) dan rentang versi pada model tidak tumpang tindih.</w:t>
       </w:r>
     </w:p>
     <w:p>
@@ -4735,7 +4819,7 @@
           <w:b/>
           <w:bCs/>
         </w:rPr>
-        <w:t xml:space="preserve">Kustom (8 tes):</w:t>
+        <w:t xml:space="preserve">Kustom (9 tes):</w:t>
       </w:r>
       <w:r>
         <w:t xml:space="preserve"> harga lebih dari 0; </w:t>
@@ -4749,7 +4833,7 @@
         <w:t xml:space="preserve">discount_pct</w:t>
       </w:r>
       <w:r>
-        <w:t xml:space="preserve"> antara 0 dan 100; harga tidak melebihi harga asli; grain fakta unik; satu observasi per listing per hari; satu versi berlaku per listing; rentang versi tidak tumpang tindih; rekomendasi tidak di bawah batas bawah.</w:t>
+        <w:t xml:space="preserve"> antara 0 dan 100; harga tidak melebihi harga asli; grain fakta unik; satu observasi per listing per hari; satu versi berlaku per listing; rentang versi tidak tumpang tindih; satu versi snapshot berlaku per listing; rekomendasi tidak di bawah batas bawah.</w:t>
       </w:r>
     </w:p>
     <w:p>
@@ -4968,7 +5052,7 @@
       <w:r>
         <w:drawing>
           <wp:inline distT="0" distB="0" distL="0" distR="0">
-            <wp:extent cx="9144000" cy="3248025"/>
+            <wp:extent cx="9144000" cy="3638550"/>
             <wp:effectExtent t="0" r="0" b="0" l="0"/>
             <wp:docPr id="1" name="lineage" descr="Diagram lineage dbt" title="Diagram lineage dbt"/>
             <wp:cNvGraphicFramePr>
@@ -4993,7 +5077,7 @@
                   <pic:spPr bwMode="auto">
                     <a:xfrm>
                       <a:off x="0" y="0"/>
-                      <a:ext cx="9144000" cy="3248025"/>
+                      <a:ext cx="9144000" cy="3638550"/>
                     </a:xfrm>
                     <a:prstGeom prst="rect">
                       <a:avLst/>
@@ -5845,7 +5929,26 @@
                 <w:sz w:val="18"/>
                 <w:szCs w:val="18"/>
               </w:rPr>
-              <w:t xml:space="preserve">SCD2 dihitung dari tanggal</w:t>
+              <w:t xml:space="preserve">SCD2: </w:t>
+            </w:r>
+            <w:r>
+              <w:rPr>
+                <w:rFonts w:ascii="Consolas" w:cs="Consolas" w:eastAsia="Consolas" w:hAnsi="Consolas"/>
+                <w:b w:val="false"/>
+                <w:bCs w:val="false"/>
+                <w:sz w:val="18"/>
+                <w:szCs w:val="18"/>
+              </w:rPr>
+              <w:t xml:space="preserve">dbt snapshot</w:t>
+            </w:r>
+            <w:r>
+              <w:rPr>
+                <w:b w:val="false"/>
+                <w:bCs w:val="false"/>
+                <w:sz w:val="18"/>
+                <w:szCs w:val="18"/>
+              </w:rPr>
+              <w:t xml:space="preserve"> dan model berbasis tanggal</w:t>
             </w:r>
           </w:p>
         </w:tc>
@@ -10784,7 +10887,26 @@
                 <w:sz w:val="18"/>
                 <w:szCs w:val="18"/>
               </w:rPr>
-              <w:t xml:space="preserve">SCD2 dihitung dari tanggal crawl</w:t>
+              <w:t xml:space="preserve">SCD2 dalam dua bentuk: </w:t>
+            </w:r>
+            <w:r>
+              <w:rPr>
+                <w:rFonts w:ascii="Consolas" w:cs="Consolas" w:eastAsia="Consolas" w:hAnsi="Consolas"/>
+                <w:b w:val="false"/>
+                <w:bCs w:val="false"/>
+                <w:sz w:val="18"/>
+                <w:szCs w:val="18"/>
+              </w:rPr>
+              <w:t xml:space="preserve">dbt snapshot</w:t>
+            </w:r>
+            <w:r>
+              <w:rPr>
+                <w:b w:val="false"/>
+                <w:bCs w:val="false"/>
+                <w:sz w:val="18"/>
+                <w:szCs w:val="18"/>
+              </w:rPr>
+              <w:t xml:space="preserve"> dan model berbasis tanggal crawl</w:t>
             </w:r>
           </w:p>
         </w:tc>
@@ -10817,7 +10939,7 @@
                 <w:sz w:val="18"/>
                 <w:szCs w:val="18"/>
               </w:rPr>
-              <w:t xml:space="preserve">Benar pada pemuatan historis</w:t>
+              <w:t xml:space="preserve">Snapshot sesuai praktik dbt; model memberi riwayat langsung pada pemuatan historis sekaligus</w:t>
             </w:r>
           </w:p>
         </w:tc>
@@ -10850,26 +10972,7 @@
                 <w:sz w:val="18"/>
                 <w:szCs w:val="18"/>
               </w:rPr>
-              <w:t xml:space="preserve">Bukan fitur </w:t>
-            </w:r>
-            <w:r>
-              <w:rPr>
-                <w:rFonts w:ascii="Consolas" w:cs="Consolas" w:eastAsia="Consolas" w:hAnsi="Consolas"/>
-                <w:b w:val="false"/>
-                <w:bCs w:val="false"/>
-                <w:sz w:val="18"/>
-                <w:szCs w:val="18"/>
-              </w:rPr>
-              <w:t xml:space="preserve">dbt snapshot</w:t>
-            </w:r>
-            <w:r>
-              <w:rPr>
-                <w:b w:val="false"/>
-                <w:bCs w:val="false"/>
-                <w:sz w:val="18"/>
-                <w:szCs w:val="18"/>
-              </w:rPr>
-              <w:t xml:space="preserve"> bawaan</w:t>
+              <w:t xml:space="preserve">Dua tabel riwayat yang perlu dijelaskan bedanya</w:t>
             </w:r>
           </w:p>
         </w:tc>
@@ -11736,7 +11839,7 @@
         <w:t xml:space="preserve">dbt build</w:t>
       </w:r>
       <w:r>
-        <w:t xml:space="preserve"> (98 hasil lulus), </w:t>
+        <w:t xml:space="preserve"> (103 hasil lulus), </w:t>
       </w:r>
       <w:r>
         <w:rPr>

</xml_diff>

<commit_message>
Set repository URL in README and documentation
</commit_message>
<xml_diff>
--- a/docs/Dokumentasi_Price_Analytics.docx
+++ b/docs/Dokumentasi_Price_Analytics.docx
@@ -1866,7 +1866,7 @@
           <w:sz w:val="18"/>
           <w:szCs w:val="18"/>
         </w:rPr>
-        <w:t xml:space="preserve">git clone &lt;URL-repository&gt;</w:t>
+        <w:t xml:space="preserve">git clone https://github.com/Hendrimegaputra24/Test-DWHOperation-BFI.git</w:t>
       </w:r>
     </w:p>
     <w:p>
@@ -1880,7 +1880,7 @@
           <w:sz w:val="18"/>
           <w:szCs w:val="18"/>
         </w:rPr>
-        <w:t xml:space="preserve">cd price-analytics</w:t>
+        <w:t xml:space="preserve">cd Test-DWHOperation-BFI</w:t>
       </w:r>
     </w:p>
     <w:p>

</xml_diff>

<commit_message>
Perbarui dokumentasi: Airflow opsional dan 44 tes
</commit_message>
<xml_diff>
--- a/docs/Dokumentasi_Price_Analytics.docx
+++ b/docs/Dokumentasi_Price_Analytics.docx
@@ -1070,7 +1070,7 @@
                 <w:sz w:val="18"/>
                 <w:szCs w:val="18"/>
               </w:rPr>
-              <w:t xml:space="preserve">Selesai. Bonus (Airflow, CI, cloud) tidak dikerjakan</w:t>
+              <w:t xml:space="preserve">Selesai. Bonus: Airflow tersedia sebagai opsi; CI dan cloud tidak dikerjakan</w:t>
             </w:r>
           </w:p>
         </w:tc>
@@ -1318,7 +1318,97 @@
                 <w:sz w:val="18"/>
                 <w:szCs w:val="18"/>
               </w:rPr>
-              <w:t xml:space="preserve">39 tes lulus</w:t>
+              <w:t xml:space="preserve">44 tes lulus</w:t>
+            </w:r>
+          </w:p>
+        </w:tc>
+      </w:tr>
+      <w:tr>
+        <w:trPr>
+          <w:cantSplit/>
+        </w:trPr>
+        <w:tc>
+          <w:tcPr>
+            <w:tcW w:type="dxa" w:w="2700"/>
+            <w:tcBorders>
+              <w:top w:val="single" w:color="BFBFBF" w:sz="4"/>
+              <w:left w:val="single" w:color="BFBFBF" w:sz="4"/>
+              <w:bottom w:val="single" w:color="BFBFBF" w:sz="4"/>
+              <w:right w:val="single" w:color="BFBFBF" w:sz="4"/>
+            </w:tcBorders>
+            <w:tcMar>
+              <w:top w:type="dxa" w:w="60"/>
+              <w:left w:type="dxa" w:w="100"/>
+              <w:bottom w:type="dxa" w:w="60"/>
+              <w:right w:type="dxa" w:w="100"/>
+            </w:tcMar>
+            <w:vAlign w:val="top"/>
+          </w:tcPr>
+          <w:p>
+            <w:pPr>
+              <w:spacing w:after="40"/>
+              <w:jc w:val="left"/>
+            </w:pPr>
+            <w:r>
+              <w:rPr>
+                <w:b w:val="false"/>
+                <w:bCs w:val="false"/>
+                <w:sz w:val="18"/>
+                <w:szCs w:val="18"/>
+              </w:rPr>
+              <w:t xml:space="preserve">Airflow (opsional)</w:t>
+            </w:r>
+          </w:p>
+        </w:tc>
+        <w:tc>
+          <w:tcPr>
+            <w:tcW w:type="dxa" w:w="6614"/>
+            <w:tcBorders>
+              <w:top w:val="single" w:color="BFBFBF" w:sz="4"/>
+              <w:left w:val="single" w:color="BFBFBF" w:sz="4"/>
+              <w:bottom w:val="single" w:color="BFBFBF" w:sz="4"/>
+              <w:right w:val="single" w:color="BFBFBF" w:sz="4"/>
+            </w:tcBorders>
+            <w:tcMar>
+              <w:top w:type="dxa" w:w="60"/>
+              <w:left w:type="dxa" w:w="100"/>
+              <w:bottom w:type="dxa" w:w="60"/>
+              <w:right w:type="dxa" w:w="100"/>
+            </w:tcMar>
+            <w:vAlign w:val="top"/>
+          </w:tcPr>
+          <w:p>
+            <w:pPr>
+              <w:spacing w:after="40"/>
+              <w:jc w:val="left"/>
+            </w:pPr>
+            <w:r>
+              <w:rPr>
+                <w:b w:val="false"/>
+                <w:bCs w:val="false"/>
+                <w:sz w:val="18"/>
+                <w:szCs w:val="18"/>
+              </w:rPr>
+              <w:t xml:space="preserve">DAG </w:t>
+            </w:r>
+            <w:r>
+              <w:rPr>
+                <w:rFonts w:ascii="Consolas" w:cs="Consolas" w:eastAsia="Consolas" w:hAnsi="Consolas"/>
+                <w:b w:val="false"/>
+                <w:bCs w:val="false"/>
+                <w:sz w:val="18"/>
+                <w:szCs w:val="18"/>
+              </w:rPr>
+              <w:t xml:space="preserve">price_pipeline_daily</w:t>
+            </w:r>
+            <w:r>
+              <w:rPr>
+                <w:b w:val="false"/>
+                <w:bCs w:val="false"/>
+                <w:sz w:val="18"/>
+                <w:szCs w:val="18"/>
+              </w:rPr>
+              <w:t xml:space="preserve"> berjalan otomatis begitu Airflow menyala; ketiga task sukses berurutan (run pertama 24 menit 39 detik di komputer pengembang saat sibuk). Data tidak bertambah karena data contoh statis</w:t>
             </w:r>
           </w:p>
         </w:tc>
@@ -2424,6 +2514,109 @@
       </w:r>
       <w:r>
         <w:t xml:space="preserve"> menghapus semuanya, termasuk dashboard Metabase. Menjalankan ulang aman (idempotent).</w:t>
+      </w:r>
+    </w:p>
+    <w:p>
+      <w:pPr>
+        <w:spacing w:after="120" w:line="276"/>
+      </w:pPr>
+      <w:r>
+        <w:rPr>
+          <w:b/>
+          <w:bCs/>
+        </w:rPr>
+        <w:t xml:space="preserve">Airflow (opsional):</w:t>
+      </w:r>
+      <w:r>
+        <w:t xml:space="preserve"> penjadwal yang menjalankan ulang pengolahan data tiap malam pukul 01.00 (Asia/Jakarta). Tidak menyala dengan </w:t>
+      </w:r>
+      <w:r>
+        <w:rPr>
+          <w:rFonts w:ascii="Consolas" w:cs="Consolas" w:eastAsia="Consolas" w:hAnsi="Consolas"/>
+          <w:sz w:val="20"/>
+          <w:szCs w:val="20"/>
+        </w:rPr>
+        <w:t xml:space="preserve">docker compose up</w:t>
+      </w:r>
+      <w:r>
+        <w:t xml:space="preserve"> biasa; nyalakan dengan </w:t>
+      </w:r>
+      <w:r>
+        <w:rPr>
+          <w:rFonts w:ascii="Consolas" w:cs="Consolas" w:eastAsia="Consolas" w:hAnsi="Consolas"/>
+          <w:sz w:val="20"/>
+          <w:szCs w:val="20"/>
+        </w:rPr>
+        <w:t xml:space="preserve">docker compose --profile airflow up -d --build</w:t>
+      </w:r>
+      <w:r>
+        <w:t xml:space="preserve">, lalu buka </w:t>
+      </w:r>
+      <w:r>
+        <w:rPr>
+          <w:rFonts w:ascii="Consolas" w:cs="Consolas" w:eastAsia="Consolas" w:hAnsi="Consolas"/>
+          <w:sz w:val="20"/>
+          <w:szCs w:val="20"/>
+        </w:rPr>
+        <w:t xml:space="preserve">http://localhost:8088</w:t>
+      </w:r>
+      <w:r>
+        <w:t xml:space="preserve"> (login </w:t>
+      </w:r>
+      <w:r>
+        <w:rPr>
+          <w:rFonts w:ascii="Consolas" w:cs="Consolas" w:eastAsia="Consolas" w:hAnsi="Consolas"/>
+          <w:sz w:val="20"/>
+          <w:szCs w:val="20"/>
+        </w:rPr>
+        <w:t xml:space="preserve">admin</w:t>
+      </w:r>
+      <w:r>
+        <w:t xml:space="preserve"> / </w:t>
+      </w:r>
+      <w:r>
+        <w:rPr>
+          <w:rFonts w:ascii="Consolas" w:cs="Consolas" w:eastAsia="Consolas" w:hAnsi="Consolas"/>
+          <w:sz w:val="20"/>
+          <w:szCs w:val="20"/>
+        </w:rPr>
+        <w:t xml:space="preserve">airflow-demo-password</w:t>
+      </w:r>
+      <w:r>
+        <w:t xml:space="preserve">). DAG </w:t>
+      </w:r>
+      <w:r>
+        <w:rPr>
+          <w:rFonts w:ascii="Consolas" w:cs="Consolas" w:eastAsia="Consolas" w:hAnsi="Consolas"/>
+          <w:sz w:val="20"/>
+          <w:szCs w:val="20"/>
+        </w:rPr>
+        <w:t xml:space="preserve">price_pipeline_daily</w:t>
+      </w:r>
+      <w:r>
+        <w:t xml:space="preserve"> menjalankan tiga task berurutan: ambil data, </w:t>
+      </w:r>
+      <w:r>
+        <w:rPr>
+          <w:rFonts w:ascii="Consolas" w:cs="Consolas" w:eastAsia="Consolas" w:hAnsi="Consolas"/>
+          <w:sz w:val="20"/>
+          <w:szCs w:val="20"/>
+        </w:rPr>
+        <w:t xml:space="preserve">dbt build</w:t>
+      </w:r>
+      <w:r>
+        <w:t xml:space="preserve">, dan hitung rekomendasi. Rincian: </w:t>
+      </w:r>
+      <w:r>
+        <w:rPr>
+          <w:rFonts w:ascii="Consolas" w:cs="Consolas" w:eastAsia="Consolas" w:hAnsi="Consolas"/>
+          <w:sz w:val="20"/>
+          <w:szCs w:val="20"/>
+        </w:rPr>
+        <w:t xml:space="preserve">docs/airflow.md</w:t>
+      </w:r>
+      <w:r>
+        <w:t xml:space="preserve">.</w:t>
       </w:r>
     </w:p>
     <w:p>
@@ -11621,10 +11814,21 @@
           <w:b/>
           <w:bCs/>
         </w:rPr>
-        <w:t xml:space="preserve">Waktu pipeline</w:t>
-      </w:r>
-      <w:r>
-        <w:t xml:space="preserve"> bergantung pada sumber daya mesin (sekitar 7 menit pada mesin pengembangan).</w:t>
+        <w:t xml:space="preserve">Airflow bersifat demonstrasi.</w:t>
+      </w:r>
+      <w:r>
+        <w:t xml:space="preserve"> Data contoh statis, sehingga run terjadwal sukses tetapi tidak menambah data baru; memakai </w:t>
+      </w:r>
+      <w:r>
+        <w:rPr>
+          <w:rFonts w:ascii="Consolas" w:cs="Consolas" w:eastAsia="Consolas" w:hAnsi="Consolas"/>
+          <w:sz w:val="20"/>
+          <w:szCs w:val="20"/>
+        </w:rPr>
+        <w:t xml:space="preserve">SequentialExecutor</w:t>
+      </w:r>
+      <w:r>
+        <w:t xml:space="preserve"> dengan SQLite, bukan konfigurasi produksi.</w:t>
       </w:r>
     </w:p>
     <w:p>
@@ -11637,6 +11841,26 @@
         <w:spacing w:after="60" w:line="276"/>
       </w:pPr>
       <w:r>
+        <w:rPr>
+          <w:b/>
+          <w:bCs/>
+        </w:rPr>
+        <w:t xml:space="preserve">Waktu pipeline</w:t>
+      </w:r>
+      <w:r>
+        <w:t xml:space="preserve"> bergantung pada sumber daya mesin (sekitar 7 menit pada mesin pengembangan).</w:t>
+      </w:r>
+    </w:p>
+    <w:p>
+      <w:pPr>
+        <w:pStyle w:val="ListParagraph"/>
+        <w:numPr>
+          <w:ilvl w:val="0"/>
+          <w:numId w:val="2"/>
+        </w:numPr>
+        <w:spacing w:after="60" w:line="276"/>
+      </w:pPr>
+      <w:r>
         <w:t xml:space="preserve">Sistem diuji pada satu mesin Windows dengan Docker; belum ada CI.</w:t>
       </w:r>
     </w:p>
@@ -11709,7 +11933,7 @@
         <w:spacing w:after="60" w:line="276"/>
       </w:pPr>
       <w:r>
-        <w:t xml:space="preserve">Orkestrasi dengan Airflow atau Dagster (crawl, dbt build, recommend, refresh) dan GitHub Actions (lint, tes unit, dbt build pada data sampel).</w:t>
+        <w:t xml:space="preserve">Penjadwalan untuk produksi: executor dan database metadata Airflow yang sesuai, serta GitHub Actions (lint, tes unit, dbt build pada data sampel).</w:t>
       </w:r>
     </w:p>
     <w:p>
@@ -11850,7 +12074,7 @@
         <w:t xml:space="preserve">pytest</w:t>
       </w:r>
       <w:r>
-        <w:t xml:space="preserve"> (39 tes lulus), hasil analisis SQL, pengujian API, uji akses situs dari dua jaringan, serta pembuatan dashboard di Metabase. Beberapa masalah lingkungan ditemukan dan diselesaikan saat itu, misalnya port 5432 yang bentrok dengan PostgreSQL lokal dan kesalahan pengisian schema di Metabase. Pengembang siap menjelaskan setiap bagian kode pada sesi wawancara.</w:t>
+        <w:t xml:space="preserve"> (44 tes lulus), hasil analisis SQL, pengujian API, uji akses situs dari dua jaringan, serta pembuatan dashboard di Metabase. Beberapa masalah lingkungan ditemukan dan diselesaikan saat itu, misalnya port 5432 yang bentrok dengan PostgreSQL lokal dan kesalahan pengisian schema di Metabase. Pengembang siap menjelaskan setiap bagian kode pada sesi wawancara.</w:t>
       </w:r>
     </w:p>
     <w:p>

</xml_diff>